<commit_message>
Refactor admin/user edit views and controller
Rename and align model attributes between controller and templates (admin -> admin, user -> editUser), add hidden "type" inputs to forms, and tidy up controller formatting and logging call alignment. Improve server- and client-side validation: enforce email format and image file checks, preserve profile image upload/preview JS, and ensure updateAdmin/updateUser flows return correct redirects. Update application.properties DB URL (ecommerce_db) and adjust tests to expect the new model attribute. (Also contains updated build artifacts and an upload doc change.)
</commit_message>
<xml_diff>
--- a/shopping-cart-spring-boot-main/uploads/academic/1/doc_0.docx
+++ b/shopping-cart-spring-boot-main/uploads/academic/1/doc_0.docx
@@ -216,7 +216,7 @@
           <w:sz w:val="32"/>
           <w:b w:val="on"/>
         </w:rPr>
-        <w:t>ที่  อว 660301.26.8/		          	วันที่22 กุมภาพันธ์ 2569</w:t>
+        <w:t>ที่  อว 660301.26.8/3		          	วันที่5 มีนาคม 2569</w:t>
       </w:r>
     </w:p>
     <w:p>
@@ -388,7 +388,7 @@
           <w:sz w:val="32"/>
           <w:b w:val="off"/>
         </w:rPr>
-        <w:t xml:space="preserve">	ข้าพเจ้า นายjo พนักงานมหาวิทยาลัย ประเภท วิชาการ ตำแหน่ง อาจารย์ ปฏิบัติงานที่ สาขาวิชาวิทยาการคอมพิวเตอร์ สังกัด วิทยาลัยการคอมพิวเตอร์ มีความประสงค์ขอรับการประเมินการสอนจากคณะอนุกรรมการประเมินผลการสอน เพื่อประกอบการขอกำหนดตำแหน่งทางวิชาการระดับ [{{chk1}}] ผู้ช่วยศาสตราจารย์  [{{chk2}}] รองศาสตราจารย์ [✓] ศาสตราจารย์ พร้อมนี้ได้แนบเอกสารประกอบการขอประเมินผลการสอน จำนวน       3 ชุด ดังนี้</w:t>
+        <w:t xml:space="preserve">	ข้าพเจ้า นายApec พนักงานมหาวิทยาลัย ประเภท วิชาการ ตำแหน่ง อาจารย์ ปฏิบัติงานที่ สาขาวิชาวิทยาการคอมพิวเตอร์ สังกัด วิทยาลัยการคอมพิวเตอร์ มีความประสงค์ขอรับการประเมินการสอนจากคณะอนุกรรมการประเมินผลการสอน เพื่อประกอบการขอกำหนดตำแหน่งทางวิชาการระดับ [✓] ผู้ช่วยศาสตราจารย์  [{{chk2}}] รองศาสตราจารย์ [{{chk3}}] ศาสตราจารย์ พร้อมนี้ได้แนบเอกสารประกอบการขอประเมินผลการสอน จำนวน       3 ชุด ดังนี้</w:t>
       </w:r>
     </w:p>
     <w:p>
@@ -708,7 +708,7 @@
           <w:sz w:val="32"/>
           <w:b w:val="off"/>
         </w:rPr>
-        <w:t xml:space="preserve">      ()</w:t>
+        <w:t xml:space="preserve">      (qwwqerr)</w:t>
       </w:r>
     </w:p>
     <w:p>

</xml_diff>